<commit_message>
docs(workshop): cập nhật WS1 + WS2 cho use case đặt trước & giỏ hàng (v1.1)
REQ-08 mở rộng: khách xem cửa hàng -> mua giao tận nhà + đặt trước hàng hết.
Thêm 5 product backlog và 15 task:
- PB-33 giỏ hàng, PB-34 đặt hàng COD, PB-35 tra đơn + xác nhận đã nhận,
  PB-36 khách đặt trước (REQ-08)
- PB-37 nhân viên quản lý phiếu đặt trước + chuyển đơn (REQ-01)
Sprint 5 đổi phạm vi: bảo hành + cửa hàng online.

Tổng: 32 -> 37 backlog, 78 -> 93 task, 342 giờ. ED giữ nguyên 18/36 (hệ số 0.5)
— nhóm không đổi, chỉ thêm use case.

Đã đọc lại file xlsx sau khi sinh: VLOOKUP giãn đúng tới $L$41, TỔNG = SUM(G5:G41),
sheet 6 E2 vẫn trỏ ED!D23 (tổng điểm) chứ không phải D24 (tỷ lệ ÷36).

Co-Authored-By: Claude Opus 4.8 <noreply@anthropic.com>
</commit_message>
<xml_diff>
--- a/doc-school/WORKSHOP_1_BShoes.docx
+++ b/doc-school/WORKSHOP_1_BShoes.docx
@@ -21,7 +21,7 @@
         <w:rPr>
           <w:i/>
         </w:rPr>
-        <w:t>WORKSHOP 1 — Phiên bản v1.0 (nhánh test-api-connect)</w:t>
+        <w:t>WORKSHOP 1 — Phiên bản v1.1 (nhánh test-api-connect — bổ sung đặt trước &amp; giỏ hàng khách)</w:t>
       </w:r>
     </w:p>
     <w:p>
@@ -133,7 +133,7 @@
               <w:rPr>
                 <w:sz w:val="18"/>
               </w:rPr>
-              <w:t>v1.0 (nhánh test-api-connect)</w:t>
+              <w:t>v1.1 (nhánh test-api-connect — bổ sung đặt trước &amp; giỏ hàng khách)</w:t>
             </w:r>
           </w:p>
         </w:tc>
@@ -3228,6 +3228,260 @@
           </w:p>
         </w:tc>
       </w:tr>
+      <w:tr>
+        <w:tc>
+          <w:tcPr>
+            <w:tcW w:type="dxa" w:w="907"/>
+          </w:tcPr>
+          <w:p>
+            <w:r/>
+            <w:r>
+              <w:rPr>
+                <w:sz w:val="18"/>
+              </w:rPr>
+              <w:t>PB-37</w:t>
+            </w:r>
+          </w:p>
+        </w:tc>
+        <w:tc>
+          <w:tcPr>
+            <w:tcW w:type="dxa" w:w="2948"/>
+          </w:tcPr>
+          <w:p>
+            <w:r/>
+            <w:r>
+              <w:rPr>
+                <w:sz w:val="18"/>
+              </w:rPr>
+              <w:t>Là nhân viên, tôi muốn quản lý phiếu đặt trước và chuyển thành đơn khi hàng về</w:t>
+            </w:r>
+          </w:p>
+        </w:tc>
+        <w:tc>
+          <w:tcPr>
+            <w:tcW w:type="dxa" w:w="794"/>
+          </w:tcPr>
+          <w:p>
+            <w:r/>
+            <w:r>
+              <w:rPr>
+                <w:sz w:val="18"/>
+              </w:rPr>
+              <w:t>T91</w:t>
+            </w:r>
+          </w:p>
+        </w:tc>
+        <w:tc>
+          <w:tcPr>
+            <w:tcW w:type="dxa" w:w="2948"/>
+          </w:tcPr>
+          <w:p>
+            <w:r/>
+            <w:r>
+              <w:rPr>
+                <w:sz w:val="18"/>
+              </w:rPr>
+              <w:t>API trạng thái + chuyển đơn</w:t>
+            </w:r>
+          </w:p>
+        </w:tc>
+        <w:tc>
+          <w:tcPr>
+            <w:tcW w:type="dxa" w:w="680"/>
+          </w:tcPr>
+          <w:p>
+            <w:r/>
+            <w:r>
+              <w:rPr>
+                <w:sz w:val="18"/>
+              </w:rPr>
+              <w:t>4</w:t>
+            </w:r>
+          </w:p>
+        </w:tc>
+        <w:tc>
+          <w:tcPr>
+            <w:tcW w:type="dxa" w:w="1020"/>
+          </w:tcPr>
+          <w:p>
+            <w:r/>
+            <w:r>
+              <w:rPr>
+                <w:sz w:val="18"/>
+              </w:rPr>
+              <w:t>DEV1</w:t>
+            </w:r>
+          </w:p>
+        </w:tc>
+      </w:tr>
+      <w:tr>
+        <w:tc>
+          <w:tcPr>
+            <w:tcW w:type="dxa" w:w="907"/>
+          </w:tcPr>
+          <w:p>
+            <w:r/>
+            <w:r>
+              <w:rPr>
+                <w:sz w:val="18"/>
+              </w:rPr>
+            </w:r>
+          </w:p>
+        </w:tc>
+        <w:tc>
+          <w:tcPr>
+            <w:tcW w:type="dxa" w:w="2948"/>
+          </w:tcPr>
+          <w:p>
+            <w:r/>
+            <w:r>
+              <w:rPr>
+                <w:sz w:val="18"/>
+              </w:rPr>
+            </w:r>
+          </w:p>
+        </w:tc>
+        <w:tc>
+          <w:tcPr>
+            <w:tcW w:type="dxa" w:w="794"/>
+          </w:tcPr>
+          <w:p>
+            <w:r/>
+            <w:r>
+              <w:rPr>
+                <w:sz w:val="18"/>
+              </w:rPr>
+              <w:t>T92</w:t>
+            </w:r>
+          </w:p>
+        </w:tc>
+        <w:tc>
+          <w:tcPr>
+            <w:tcW w:type="dxa" w:w="2948"/>
+          </w:tcPr>
+          <w:p>
+            <w:r/>
+            <w:r>
+              <w:rPr>
+                <w:sz w:val="18"/>
+              </w:rPr>
+              <w:t>Màn quản lý đặt trước</w:t>
+            </w:r>
+          </w:p>
+        </w:tc>
+        <w:tc>
+          <w:tcPr>
+            <w:tcW w:type="dxa" w:w="680"/>
+          </w:tcPr>
+          <w:p>
+            <w:r/>
+            <w:r>
+              <w:rPr>
+                <w:sz w:val="18"/>
+              </w:rPr>
+              <w:t>5</w:t>
+            </w:r>
+          </w:p>
+        </w:tc>
+        <w:tc>
+          <w:tcPr>
+            <w:tcW w:type="dxa" w:w="1020"/>
+          </w:tcPr>
+          <w:p>
+            <w:r/>
+            <w:r>
+              <w:rPr>
+                <w:sz w:val="18"/>
+              </w:rPr>
+              <w:t>DEV2</w:t>
+            </w:r>
+          </w:p>
+        </w:tc>
+      </w:tr>
+      <w:tr>
+        <w:tc>
+          <w:tcPr>
+            <w:tcW w:type="dxa" w:w="907"/>
+          </w:tcPr>
+          <w:p>
+            <w:r/>
+            <w:r>
+              <w:rPr>
+                <w:sz w:val="18"/>
+              </w:rPr>
+            </w:r>
+          </w:p>
+        </w:tc>
+        <w:tc>
+          <w:tcPr>
+            <w:tcW w:type="dxa" w:w="2948"/>
+          </w:tcPr>
+          <w:p>
+            <w:r/>
+            <w:r>
+              <w:rPr>
+                <w:sz w:val="18"/>
+              </w:rPr>
+            </w:r>
+          </w:p>
+        </w:tc>
+        <w:tc>
+          <w:tcPr>
+            <w:tcW w:type="dxa" w:w="794"/>
+          </w:tcPr>
+          <w:p>
+            <w:r/>
+            <w:r>
+              <w:rPr>
+                <w:sz w:val="18"/>
+              </w:rPr>
+              <w:t>T93</w:t>
+            </w:r>
+          </w:p>
+        </w:tc>
+        <w:tc>
+          <w:tcPr>
+            <w:tcW w:type="dxa" w:w="2948"/>
+          </w:tcPr>
+          <w:p>
+            <w:r/>
+            <w:r>
+              <w:rPr>
+                <w:sz w:val="18"/>
+              </w:rPr>
+              <w:t>Test luồng đặt trước</w:t>
+            </w:r>
+          </w:p>
+        </w:tc>
+        <w:tc>
+          <w:tcPr>
+            <w:tcW w:type="dxa" w:w="680"/>
+          </w:tcPr>
+          <w:p>
+            <w:r/>
+            <w:r>
+              <w:rPr>
+                <w:sz w:val="18"/>
+              </w:rPr>
+              <w:t>3</w:t>
+            </w:r>
+          </w:p>
+        </w:tc>
+        <w:tc>
+          <w:tcPr>
+            <w:tcW w:type="dxa" w:w="1020"/>
+          </w:tcPr>
+          <w:p>
+            <w:r/>
+            <w:r>
+              <w:rPr>
+                <w:sz w:val="18"/>
+              </w:rPr>
+              <w:t>QC</w:t>
+            </w:r>
+          </w:p>
+        </w:tc>
+      </w:tr>
     </w:tbl>
     <w:p>
       <w:pPr>
@@ -7887,7 +8141,7 @@
         <w:rPr>
           <w:color w:val="0B895A"/>
         </w:rPr>
-        <w:t>REQ-08 — Tôi muốn xem cửa hàng online để chọn giày trước khi tới mua.</w:t>
+        <w:t>REQ-08 — Tôi muốn xem cửa hàng online, đặt mua giao tận nhà và đặt trước mẫu đang hết hàng.</w:t>
       </w:r>
     </w:p>
     <w:p>
@@ -8154,6 +8408,1022 @@
                 <w:sz w:val="18"/>
               </w:rPr>
               <w:t>6</w:t>
+            </w:r>
+          </w:p>
+        </w:tc>
+        <w:tc>
+          <w:tcPr>
+            <w:tcW w:type="dxa" w:w="1020"/>
+          </w:tcPr>
+          <w:p>
+            <w:r/>
+            <w:r>
+              <w:rPr>
+                <w:sz w:val="18"/>
+              </w:rPr>
+              <w:t>DEV2</w:t>
+            </w:r>
+          </w:p>
+        </w:tc>
+      </w:tr>
+      <w:tr>
+        <w:tc>
+          <w:tcPr>
+            <w:tcW w:type="dxa" w:w="907"/>
+          </w:tcPr>
+          <w:p>
+            <w:r/>
+            <w:r>
+              <w:rPr>
+                <w:sz w:val="18"/>
+              </w:rPr>
+              <w:t>PB-33</w:t>
+            </w:r>
+          </w:p>
+        </w:tc>
+        <w:tc>
+          <w:tcPr>
+            <w:tcW w:type="dxa" w:w="2948"/>
+          </w:tcPr>
+          <w:p>
+            <w:r/>
+            <w:r>
+              <w:rPr>
+                <w:sz w:val="18"/>
+              </w:rPr>
+              <w:t>Là khách hàng, tôi muốn thêm giày vào giỏ hàng</w:t>
+            </w:r>
+          </w:p>
+        </w:tc>
+        <w:tc>
+          <w:tcPr>
+            <w:tcW w:type="dxa" w:w="794"/>
+          </w:tcPr>
+          <w:p>
+            <w:r/>
+            <w:r>
+              <w:rPr>
+                <w:sz w:val="18"/>
+              </w:rPr>
+              <w:t>T79</w:t>
+            </w:r>
+          </w:p>
+        </w:tc>
+        <w:tc>
+          <w:tcPr>
+            <w:tcW w:type="dxa" w:w="2948"/>
+          </w:tcPr>
+          <w:p>
+            <w:r/>
+            <w:r>
+              <w:rPr>
+                <w:sz w:val="18"/>
+              </w:rPr>
+              <w:t>API /san-pham-chi-tiet/store</w:t>
+            </w:r>
+          </w:p>
+        </w:tc>
+        <w:tc>
+          <w:tcPr>
+            <w:tcW w:type="dxa" w:w="680"/>
+          </w:tcPr>
+          <w:p>
+            <w:r/>
+            <w:r>
+              <w:rPr>
+                <w:sz w:val="18"/>
+              </w:rPr>
+              <w:t>2</w:t>
+            </w:r>
+          </w:p>
+        </w:tc>
+        <w:tc>
+          <w:tcPr>
+            <w:tcW w:type="dxa" w:w="1020"/>
+          </w:tcPr>
+          <w:p>
+            <w:r/>
+            <w:r>
+              <w:rPr>
+                <w:sz w:val="18"/>
+              </w:rPr>
+              <w:t>DEV1</w:t>
+            </w:r>
+          </w:p>
+        </w:tc>
+      </w:tr>
+      <w:tr>
+        <w:tc>
+          <w:tcPr>
+            <w:tcW w:type="dxa" w:w="907"/>
+          </w:tcPr>
+          <w:p>
+            <w:r/>
+            <w:r>
+              <w:rPr>
+                <w:sz w:val="18"/>
+              </w:rPr>
+            </w:r>
+          </w:p>
+        </w:tc>
+        <w:tc>
+          <w:tcPr>
+            <w:tcW w:type="dxa" w:w="2948"/>
+          </w:tcPr>
+          <w:p>
+            <w:r/>
+            <w:r>
+              <w:rPr>
+                <w:sz w:val="18"/>
+              </w:rPr>
+            </w:r>
+          </w:p>
+        </w:tc>
+        <w:tc>
+          <w:tcPr>
+            <w:tcW w:type="dxa" w:w="794"/>
+          </w:tcPr>
+          <w:p>
+            <w:r/>
+            <w:r>
+              <w:rPr>
+                <w:sz w:val="18"/>
+              </w:rPr>
+              <w:t>T80</w:t>
+            </w:r>
+          </w:p>
+        </w:tc>
+        <w:tc>
+          <w:tcPr>
+            <w:tcW w:type="dxa" w:w="2948"/>
+          </w:tcPr>
+          <w:p>
+            <w:r/>
+            <w:r>
+              <w:rPr>
+                <w:sz w:val="18"/>
+              </w:rPr>
+              <w:t>Composable useCart</w:t>
+            </w:r>
+          </w:p>
+        </w:tc>
+        <w:tc>
+          <w:tcPr>
+            <w:tcW w:type="dxa" w:w="680"/>
+          </w:tcPr>
+          <w:p>
+            <w:r/>
+            <w:r>
+              <w:rPr>
+                <w:sz w:val="18"/>
+              </w:rPr>
+              <w:t>3</w:t>
+            </w:r>
+          </w:p>
+        </w:tc>
+        <w:tc>
+          <w:tcPr>
+            <w:tcW w:type="dxa" w:w="1020"/>
+          </w:tcPr>
+          <w:p>
+            <w:r/>
+            <w:r>
+              <w:rPr>
+                <w:sz w:val="18"/>
+              </w:rPr>
+              <w:t>DEV2</w:t>
+            </w:r>
+          </w:p>
+        </w:tc>
+      </w:tr>
+      <w:tr>
+        <w:tc>
+          <w:tcPr>
+            <w:tcW w:type="dxa" w:w="907"/>
+          </w:tcPr>
+          <w:p>
+            <w:r/>
+            <w:r>
+              <w:rPr>
+                <w:sz w:val="18"/>
+              </w:rPr>
+            </w:r>
+          </w:p>
+        </w:tc>
+        <w:tc>
+          <w:tcPr>
+            <w:tcW w:type="dxa" w:w="2948"/>
+          </w:tcPr>
+          <w:p>
+            <w:r/>
+            <w:r>
+              <w:rPr>
+                <w:sz w:val="18"/>
+              </w:rPr>
+            </w:r>
+          </w:p>
+        </w:tc>
+        <w:tc>
+          <w:tcPr>
+            <w:tcW w:type="dxa" w:w="794"/>
+          </w:tcPr>
+          <w:p>
+            <w:r/>
+            <w:r>
+              <w:rPr>
+                <w:sz w:val="18"/>
+              </w:rPr>
+              <w:t>T81</w:t>
+            </w:r>
+          </w:p>
+        </w:tc>
+        <w:tc>
+          <w:tcPr>
+            <w:tcW w:type="dxa" w:w="2948"/>
+          </w:tcPr>
+          <w:p>
+            <w:r/>
+            <w:r>
+              <w:rPr>
+                <w:sz w:val="18"/>
+              </w:rPr>
+              <w:t>Nút Thêm vào giỏ ở trang chủ</w:t>
+            </w:r>
+          </w:p>
+        </w:tc>
+        <w:tc>
+          <w:tcPr>
+            <w:tcW w:type="dxa" w:w="680"/>
+          </w:tcPr>
+          <w:p>
+            <w:r/>
+            <w:r>
+              <w:rPr>
+                <w:sz w:val="18"/>
+              </w:rPr>
+              <w:t>2</w:t>
+            </w:r>
+          </w:p>
+        </w:tc>
+        <w:tc>
+          <w:tcPr>
+            <w:tcW w:type="dxa" w:w="1020"/>
+          </w:tcPr>
+          <w:p>
+            <w:r/>
+            <w:r>
+              <w:rPr>
+                <w:sz w:val="18"/>
+              </w:rPr>
+              <w:t>DEV2</w:t>
+            </w:r>
+          </w:p>
+        </w:tc>
+      </w:tr>
+      <w:tr>
+        <w:tc>
+          <w:tcPr>
+            <w:tcW w:type="dxa" w:w="907"/>
+          </w:tcPr>
+          <w:p>
+            <w:r/>
+            <w:r>
+              <w:rPr>
+                <w:sz w:val="18"/>
+              </w:rPr>
+              <w:t>PB-34</w:t>
+            </w:r>
+          </w:p>
+        </w:tc>
+        <w:tc>
+          <w:tcPr>
+            <w:tcW w:type="dxa" w:w="2948"/>
+          </w:tcPr>
+          <w:p>
+            <w:r/>
+            <w:r>
+              <w:rPr>
+                <w:sz w:val="18"/>
+              </w:rPr>
+              <w:t>Là khách hàng, tôi muốn đặt hàng giao tận nhà (COD)</w:t>
+            </w:r>
+          </w:p>
+        </w:tc>
+        <w:tc>
+          <w:tcPr>
+            <w:tcW w:type="dxa" w:w="794"/>
+          </w:tcPr>
+          <w:p>
+            <w:r/>
+            <w:r>
+              <w:rPr>
+                <w:sz w:val="18"/>
+              </w:rPr>
+              <w:t>T82</w:t>
+            </w:r>
+          </w:p>
+        </w:tc>
+        <w:tc>
+          <w:tcPr>
+            <w:tcW w:type="dxa" w:w="2948"/>
+          </w:tcPr>
+          <w:p>
+            <w:r/>
+            <w:r>
+              <w:rPr>
+                <w:sz w:val="18"/>
+              </w:rPr>
+              <w:t>API POST /gio-hang/checkout</w:t>
+            </w:r>
+          </w:p>
+        </w:tc>
+        <w:tc>
+          <w:tcPr>
+            <w:tcW w:type="dxa" w:w="680"/>
+          </w:tcPr>
+          <w:p>
+            <w:r/>
+            <w:r>
+              <w:rPr>
+                <w:sz w:val="18"/>
+              </w:rPr>
+              <w:t>5</w:t>
+            </w:r>
+          </w:p>
+        </w:tc>
+        <w:tc>
+          <w:tcPr>
+            <w:tcW w:type="dxa" w:w="1020"/>
+          </w:tcPr>
+          <w:p>
+            <w:r/>
+            <w:r>
+              <w:rPr>
+                <w:sz w:val="18"/>
+              </w:rPr>
+              <w:t>DEV1</w:t>
+            </w:r>
+          </w:p>
+        </w:tc>
+      </w:tr>
+      <w:tr>
+        <w:tc>
+          <w:tcPr>
+            <w:tcW w:type="dxa" w:w="907"/>
+          </w:tcPr>
+          <w:p>
+            <w:r/>
+            <w:r>
+              <w:rPr>
+                <w:sz w:val="18"/>
+              </w:rPr>
+            </w:r>
+          </w:p>
+        </w:tc>
+        <w:tc>
+          <w:tcPr>
+            <w:tcW w:type="dxa" w:w="2948"/>
+          </w:tcPr>
+          <w:p>
+            <w:r/>
+            <w:r>
+              <w:rPr>
+                <w:sz w:val="18"/>
+              </w:rPr>
+            </w:r>
+          </w:p>
+        </w:tc>
+        <w:tc>
+          <w:tcPr>
+            <w:tcW w:type="dxa" w:w="794"/>
+          </w:tcPr>
+          <w:p>
+            <w:r/>
+            <w:r>
+              <w:rPr>
+                <w:sz w:val="18"/>
+              </w:rPr>
+              <w:t>T83</w:t>
+            </w:r>
+          </w:p>
+        </w:tc>
+        <w:tc>
+          <w:tcPr>
+            <w:tcW w:type="dxa" w:w="2948"/>
+          </w:tcPr>
+          <w:p>
+            <w:r/>
+            <w:r>
+              <w:rPr>
+                <w:sz w:val="18"/>
+              </w:rPr>
+              <w:t>Màn giỏ hàng + form nhận hàng</w:t>
+            </w:r>
+          </w:p>
+        </w:tc>
+        <w:tc>
+          <w:tcPr>
+            <w:tcW w:type="dxa" w:w="680"/>
+          </w:tcPr>
+          <w:p>
+            <w:r/>
+            <w:r>
+              <w:rPr>
+                <w:sz w:val="18"/>
+              </w:rPr>
+              <w:t>5</w:t>
+            </w:r>
+          </w:p>
+        </w:tc>
+        <w:tc>
+          <w:tcPr>
+            <w:tcW w:type="dxa" w:w="1020"/>
+          </w:tcPr>
+          <w:p>
+            <w:r/>
+            <w:r>
+              <w:rPr>
+                <w:sz w:val="18"/>
+              </w:rPr>
+              <w:t>DEV2</w:t>
+            </w:r>
+          </w:p>
+        </w:tc>
+      </w:tr>
+      <w:tr>
+        <w:tc>
+          <w:tcPr>
+            <w:tcW w:type="dxa" w:w="907"/>
+          </w:tcPr>
+          <w:p>
+            <w:r/>
+            <w:r>
+              <w:rPr>
+                <w:sz w:val="18"/>
+              </w:rPr>
+            </w:r>
+          </w:p>
+        </w:tc>
+        <w:tc>
+          <w:tcPr>
+            <w:tcW w:type="dxa" w:w="2948"/>
+          </w:tcPr>
+          <w:p>
+            <w:r/>
+            <w:r>
+              <w:rPr>
+                <w:sz w:val="18"/>
+              </w:rPr>
+            </w:r>
+          </w:p>
+        </w:tc>
+        <w:tc>
+          <w:tcPr>
+            <w:tcW w:type="dxa" w:w="794"/>
+          </w:tcPr>
+          <w:p>
+            <w:r/>
+            <w:r>
+              <w:rPr>
+                <w:sz w:val="18"/>
+              </w:rPr>
+              <w:t>T84</w:t>
+            </w:r>
+          </w:p>
+        </w:tc>
+        <w:tc>
+          <w:tcPr>
+            <w:tcW w:type="dxa" w:w="2948"/>
+          </w:tcPr>
+          <w:p>
+            <w:r/>
+            <w:r>
+              <w:rPr>
+                <w:sz w:val="18"/>
+              </w:rPr>
+              <w:t>Test đặt hàng online</w:t>
+            </w:r>
+          </w:p>
+        </w:tc>
+        <w:tc>
+          <w:tcPr>
+            <w:tcW w:type="dxa" w:w="680"/>
+          </w:tcPr>
+          <w:p>
+            <w:r/>
+            <w:r>
+              <w:rPr>
+                <w:sz w:val="18"/>
+              </w:rPr>
+              <w:t>3</w:t>
+            </w:r>
+          </w:p>
+        </w:tc>
+        <w:tc>
+          <w:tcPr>
+            <w:tcW w:type="dxa" w:w="1020"/>
+          </w:tcPr>
+          <w:p>
+            <w:r/>
+            <w:r>
+              <w:rPr>
+                <w:sz w:val="18"/>
+              </w:rPr>
+              <w:t>QC</w:t>
+            </w:r>
+          </w:p>
+        </w:tc>
+      </w:tr>
+      <w:tr>
+        <w:tc>
+          <w:tcPr>
+            <w:tcW w:type="dxa" w:w="907"/>
+          </w:tcPr>
+          <w:p>
+            <w:r/>
+            <w:r>
+              <w:rPr>
+                <w:sz w:val="18"/>
+              </w:rPr>
+              <w:t>PB-35</w:t>
+            </w:r>
+          </w:p>
+        </w:tc>
+        <w:tc>
+          <w:tcPr>
+            <w:tcW w:type="dxa" w:w="2948"/>
+          </w:tcPr>
+          <w:p>
+            <w:r/>
+            <w:r>
+              <w:rPr>
+                <w:sz w:val="18"/>
+              </w:rPr>
+              <w:t>Là khách hàng, tôi muốn tra cứu đơn của tôi và xác nhận đã nhận</w:t>
+            </w:r>
+          </w:p>
+        </w:tc>
+        <w:tc>
+          <w:tcPr>
+            <w:tcW w:type="dxa" w:w="794"/>
+          </w:tcPr>
+          <w:p>
+            <w:r/>
+            <w:r>
+              <w:rPr>
+                <w:sz w:val="18"/>
+              </w:rPr>
+              <w:t>T85</w:t>
+            </w:r>
+          </w:p>
+        </w:tc>
+        <w:tc>
+          <w:tcPr>
+            <w:tcW w:type="dxa" w:w="2948"/>
+          </w:tcPr>
+          <w:p>
+            <w:r/>
+            <w:r>
+              <w:rPr>
+                <w:sz w:val="18"/>
+              </w:rPr>
+              <w:t>API GET /gio-hang/don-hang</w:t>
+            </w:r>
+          </w:p>
+        </w:tc>
+        <w:tc>
+          <w:tcPr>
+            <w:tcW w:type="dxa" w:w="680"/>
+          </w:tcPr>
+          <w:p>
+            <w:r/>
+            <w:r>
+              <w:rPr>
+                <w:sz w:val="18"/>
+              </w:rPr>
+              <w:t>2</w:t>
+            </w:r>
+          </w:p>
+        </w:tc>
+        <w:tc>
+          <w:tcPr>
+            <w:tcW w:type="dxa" w:w="1020"/>
+          </w:tcPr>
+          <w:p>
+            <w:r/>
+            <w:r>
+              <w:rPr>
+                <w:sz w:val="18"/>
+              </w:rPr>
+              <w:t>DEV1</w:t>
+            </w:r>
+          </w:p>
+        </w:tc>
+      </w:tr>
+      <w:tr>
+        <w:tc>
+          <w:tcPr>
+            <w:tcW w:type="dxa" w:w="907"/>
+          </w:tcPr>
+          <w:p>
+            <w:r/>
+            <w:r>
+              <w:rPr>
+                <w:sz w:val="18"/>
+              </w:rPr>
+            </w:r>
+          </w:p>
+        </w:tc>
+        <w:tc>
+          <w:tcPr>
+            <w:tcW w:type="dxa" w:w="2948"/>
+          </w:tcPr>
+          <w:p>
+            <w:r/>
+            <w:r>
+              <w:rPr>
+                <w:sz w:val="18"/>
+              </w:rPr>
+            </w:r>
+          </w:p>
+        </w:tc>
+        <w:tc>
+          <w:tcPr>
+            <w:tcW w:type="dxa" w:w="794"/>
+          </w:tcPr>
+          <w:p>
+            <w:r/>
+            <w:r>
+              <w:rPr>
+                <w:sz w:val="18"/>
+              </w:rPr>
+              <w:t>T86</w:t>
+            </w:r>
+          </w:p>
+        </w:tc>
+        <w:tc>
+          <w:tcPr>
+            <w:tcW w:type="dxa" w:w="2948"/>
+          </w:tcPr>
+          <w:p>
+            <w:r/>
+            <w:r>
+              <w:rPr>
+                <w:sz w:val="18"/>
+              </w:rPr>
+              <w:t>API PUT /gio-hang/nhan-hang/{id}</w:t>
+            </w:r>
+          </w:p>
+        </w:tc>
+        <w:tc>
+          <w:tcPr>
+            <w:tcW w:type="dxa" w:w="680"/>
+          </w:tcPr>
+          <w:p>
+            <w:r/>
+            <w:r>
+              <w:rPr>
+                <w:sz w:val="18"/>
+              </w:rPr>
+              <w:t>1</w:t>
+            </w:r>
+          </w:p>
+        </w:tc>
+        <w:tc>
+          <w:tcPr>
+            <w:tcW w:type="dxa" w:w="1020"/>
+          </w:tcPr>
+          <w:p>
+            <w:r/>
+            <w:r>
+              <w:rPr>
+                <w:sz w:val="18"/>
+              </w:rPr>
+              <w:t>DEV1</w:t>
+            </w:r>
+          </w:p>
+        </w:tc>
+      </w:tr>
+      <w:tr>
+        <w:tc>
+          <w:tcPr>
+            <w:tcW w:type="dxa" w:w="907"/>
+          </w:tcPr>
+          <w:p>
+            <w:r/>
+            <w:r>
+              <w:rPr>
+                <w:sz w:val="18"/>
+              </w:rPr>
+            </w:r>
+          </w:p>
+        </w:tc>
+        <w:tc>
+          <w:tcPr>
+            <w:tcW w:type="dxa" w:w="2948"/>
+          </w:tcPr>
+          <w:p>
+            <w:r/>
+            <w:r>
+              <w:rPr>
+                <w:sz w:val="18"/>
+              </w:rPr>
+            </w:r>
+          </w:p>
+        </w:tc>
+        <w:tc>
+          <w:tcPr>
+            <w:tcW w:type="dxa" w:w="794"/>
+          </w:tcPr>
+          <w:p>
+            <w:r/>
+            <w:r>
+              <w:rPr>
+                <w:sz w:val="18"/>
+              </w:rPr>
+              <w:t>T87</w:t>
+            </w:r>
+          </w:p>
+        </w:tc>
+        <w:tc>
+          <w:tcPr>
+            <w:tcW w:type="dxa" w:w="2948"/>
+          </w:tcPr>
+          <w:p>
+            <w:r/>
+            <w:r>
+              <w:rPr>
+                <w:sz w:val="18"/>
+              </w:rPr>
+              <w:t>Tab Đơn của tôi</w:t>
+            </w:r>
+          </w:p>
+        </w:tc>
+        <w:tc>
+          <w:tcPr>
+            <w:tcW w:type="dxa" w:w="680"/>
+          </w:tcPr>
+          <w:p>
+            <w:r/>
+            <w:r>
+              <w:rPr>
+                <w:sz w:val="18"/>
+              </w:rPr>
+              <w:t>4</w:t>
+            </w:r>
+          </w:p>
+        </w:tc>
+        <w:tc>
+          <w:tcPr>
+            <w:tcW w:type="dxa" w:w="1020"/>
+          </w:tcPr>
+          <w:p>
+            <w:r/>
+            <w:r>
+              <w:rPr>
+                <w:sz w:val="18"/>
+              </w:rPr>
+              <w:t>DEV2</w:t>
+            </w:r>
+          </w:p>
+        </w:tc>
+      </w:tr>
+      <w:tr>
+        <w:tc>
+          <w:tcPr>
+            <w:tcW w:type="dxa" w:w="907"/>
+          </w:tcPr>
+          <w:p>
+            <w:r/>
+            <w:r>
+              <w:rPr>
+                <w:sz w:val="18"/>
+              </w:rPr>
+              <w:t>PB-36</w:t>
+            </w:r>
+          </w:p>
+        </w:tc>
+        <w:tc>
+          <w:tcPr>
+            <w:tcW w:type="dxa" w:w="2948"/>
+          </w:tcPr>
+          <w:p>
+            <w:r/>
+            <w:r>
+              <w:rPr>
+                <w:sz w:val="18"/>
+              </w:rPr>
+              <w:t>Là khách hàng, tôi muốn đặt trước mẫu đang hết hàng</w:t>
+            </w:r>
+          </w:p>
+        </w:tc>
+        <w:tc>
+          <w:tcPr>
+            <w:tcW w:type="dxa" w:w="794"/>
+          </w:tcPr>
+          <w:p>
+            <w:r/>
+            <w:r>
+              <w:rPr>
+                <w:sz w:val="18"/>
+              </w:rPr>
+              <w:t>T88</w:t>
+            </w:r>
+          </w:p>
+        </w:tc>
+        <w:tc>
+          <w:tcPr>
+            <w:tcW w:type="dxa" w:w="2948"/>
+          </w:tcPr>
+          <w:p>
+            <w:r/>
+            <w:r>
+              <w:rPr>
+                <w:sz w:val="18"/>
+              </w:rPr>
+              <w:t>Bảng dat_truoc + entity/repo</w:t>
+            </w:r>
+          </w:p>
+        </w:tc>
+        <w:tc>
+          <w:tcPr>
+            <w:tcW w:type="dxa" w:w="680"/>
+          </w:tcPr>
+          <w:p>
+            <w:r/>
+            <w:r>
+              <w:rPr>
+                <w:sz w:val="18"/>
+              </w:rPr>
+              <w:t>4</w:t>
+            </w:r>
+          </w:p>
+        </w:tc>
+        <w:tc>
+          <w:tcPr>
+            <w:tcW w:type="dxa" w:w="1020"/>
+          </w:tcPr>
+          <w:p>
+            <w:r/>
+            <w:r>
+              <w:rPr>
+                <w:sz w:val="18"/>
+              </w:rPr>
+              <w:t>DEV1</w:t>
+            </w:r>
+          </w:p>
+        </w:tc>
+      </w:tr>
+      <w:tr>
+        <w:tc>
+          <w:tcPr>
+            <w:tcW w:type="dxa" w:w="907"/>
+          </w:tcPr>
+          <w:p>
+            <w:r/>
+            <w:r>
+              <w:rPr>
+                <w:sz w:val="18"/>
+              </w:rPr>
+            </w:r>
+          </w:p>
+        </w:tc>
+        <w:tc>
+          <w:tcPr>
+            <w:tcW w:type="dxa" w:w="2948"/>
+          </w:tcPr>
+          <w:p>
+            <w:r/>
+            <w:r>
+              <w:rPr>
+                <w:sz w:val="18"/>
+              </w:rPr>
+            </w:r>
+          </w:p>
+        </w:tc>
+        <w:tc>
+          <w:tcPr>
+            <w:tcW w:type="dxa" w:w="794"/>
+          </w:tcPr>
+          <w:p>
+            <w:r/>
+            <w:r>
+              <w:rPr>
+                <w:sz w:val="18"/>
+              </w:rPr>
+              <w:t>T89</w:t>
+            </w:r>
+          </w:p>
+        </w:tc>
+        <w:tc>
+          <w:tcPr>
+            <w:tcW w:type="dxa" w:w="2948"/>
+          </w:tcPr>
+          <w:p>
+            <w:r/>
+            <w:r>
+              <w:rPr>
+                <w:sz w:val="18"/>
+              </w:rPr>
+              <w:t>API POST /api/dat-truoc</w:t>
+            </w:r>
+          </w:p>
+        </w:tc>
+        <w:tc>
+          <w:tcPr>
+            <w:tcW w:type="dxa" w:w="680"/>
+          </w:tcPr>
+          <w:p>
+            <w:r/>
+            <w:r>
+              <w:rPr>
+                <w:sz w:val="18"/>
+              </w:rPr>
+              <w:t>3</w:t>
+            </w:r>
+          </w:p>
+        </w:tc>
+        <w:tc>
+          <w:tcPr>
+            <w:tcW w:type="dxa" w:w="1020"/>
+          </w:tcPr>
+          <w:p>
+            <w:r/>
+            <w:r>
+              <w:rPr>
+                <w:sz w:val="18"/>
+              </w:rPr>
+              <w:t>DEV1</w:t>
+            </w:r>
+          </w:p>
+        </w:tc>
+      </w:tr>
+      <w:tr>
+        <w:tc>
+          <w:tcPr>
+            <w:tcW w:type="dxa" w:w="907"/>
+          </w:tcPr>
+          <w:p>
+            <w:r/>
+            <w:r>
+              <w:rPr>
+                <w:sz w:val="18"/>
+              </w:rPr>
+            </w:r>
+          </w:p>
+        </w:tc>
+        <w:tc>
+          <w:tcPr>
+            <w:tcW w:type="dxa" w:w="2948"/>
+          </w:tcPr>
+          <w:p>
+            <w:r/>
+            <w:r>
+              <w:rPr>
+                <w:sz w:val="18"/>
+              </w:rPr>
+            </w:r>
+          </w:p>
+        </w:tc>
+        <w:tc>
+          <w:tcPr>
+            <w:tcW w:type="dxa" w:w="794"/>
+          </w:tcPr>
+          <w:p>
+            <w:r/>
+            <w:r>
+              <w:rPr>
+                <w:sz w:val="18"/>
+              </w:rPr>
+              <w:t>T90</w:t>
+            </w:r>
+          </w:p>
+        </w:tc>
+        <w:tc>
+          <w:tcPr>
+            <w:tcW w:type="dxa" w:w="2948"/>
+          </w:tcPr>
+          <w:p>
+            <w:r/>
+            <w:r>
+              <w:rPr>
+                <w:sz w:val="18"/>
+              </w:rPr>
+              <w:t>Nút + modal Đặt trước ở trang chủ</w:t>
+            </w:r>
+          </w:p>
+        </w:tc>
+        <w:tc>
+          <w:tcPr>
+            <w:tcW w:type="dxa" w:w="680"/>
+          </w:tcPr>
+          <w:p>
+            <w:r/>
+            <w:r>
+              <w:rPr>
+                <w:sz w:val="18"/>
+              </w:rPr>
+              <w:t>4</w:t>
             </w:r>
           </w:p>
         </w:tc>
@@ -8978,7 +10248,7 @@
               <w:rPr>
                 <w:sz w:val="18"/>
               </w:rPr>
-              <w:t>Bảo hành &amp; trang chủ cửa hàng</w:t>
+              <w:t>Bảo hành &amp; cửa hàng online: trang chủ, giỏ hàng, đặt hàng COD, đặt trước</w:t>
             </w:r>
           </w:p>
         </w:tc>
@@ -8992,7 +10262,7 @@
               <w:rPr>
                 <w:sz w:val="18"/>
               </w:rPr>
-              <w:t>PB-18, PB-19, PB-20, PB-31</w:t>
+              <w:t>PB-18, PB-19, PB-20, PB-31, PB-33, PB-34, PB-35, PB-36, PB-37</w:t>
             </w:r>
           </w:p>
         </w:tc>
@@ -9020,7 +10290,7 @@
               <w:rPr>
                 <w:sz w:val="18"/>
               </w:rPr>
-              <w:t>34</w:t>
+              <w:t>84</w:t>
             </w:r>
           </w:p>
         </w:tc>

</xml_diff>